<commit_message>
Rework proposal budget to include transport and on-site meal costs
- Add taxi (material transport) and public transit lines, event-day staff meals
- Rebalance materials, printing and advisory lines to keep the 2,500,000 KRW total
- Note in proposal that lodging is excluded because all sites are day trips from Samnye
- Guide: phone questions on travel/meal eligibility and receipt rules for each

Co-Authored-By: Claude Opus 5.5 <noreply@anthropic.com>
Claude-Session: https://claude.ai/code/session_01NDoRiKaAXViig1GMEb8vNv
</commit_message>
<xml_diff>
--- a/리빙랩_완주_다시차/다시차_제안서_초안.docx
+++ b/리빙랩_완주_다시차/다시차_제안서_초안.docx
@@ -3642,7 +3642,7 @@
                 <w:rFonts w:ascii="맑은 고딕" w:hAnsi="맑은 고딕" w:eastAsia="맑은 고딕"/>
                 <w:sz w:val="17"/>
               </w:rPr>
-              <w:t>잔여 농산물 매입: 봉동 생강 20kg × 10,000원</w:t>
+              <w:t>[재료비] 잔여 농산물 매입: 봉동 생강 20kg × 10,000원</w:t>
             </w:r>
           </w:p>
         </w:tc>
@@ -3732,7 +3732,7 @@
                 <w:rFonts w:ascii="맑은 고딕" w:hAnsi="맑은 고딕" w:eastAsia="맑은 고딕"/>
                 <w:sz w:val="17"/>
               </w:rPr>
-              <w:t>잔여 농산물 매입: 대추·배·도라지·사과 등</w:t>
+              <w:t>[재료비] 잔여 농산물 매입: 대추·배·도라지·사과 등</w:t>
             </w:r>
           </w:p>
           <w:p>
@@ -3834,7 +3834,7 @@
                 <w:rFonts w:ascii="맑은 고딕" w:hAnsi="맑은 고딕" w:eastAsia="맑은 고딕"/>
                 <w:sz w:val="17"/>
               </w:rPr>
-              <w:t>원데이클래스 재료: 유리병·설탕·꿀·계피·라벨·</w:t>
+              <w:t>[재료비] 원데이클래스 재료: 유리병·설탕·꿀·계피·라벨·</w:t>
             </w:r>
           </w:p>
           <w:p>
@@ -3846,7 +3846,7 @@
                 <w:rFonts w:ascii="맑은 고딕" w:hAnsi="맑은 고딕" w:eastAsia="맑은 고딕"/>
                 <w:sz w:val="17"/>
               </w:rPr>
-              <w:t>위생용품 등 60인분 × 10,000원</w:t>
+              <w:t>위생용품 등 60인분 × 8,000원</w:t>
             </w:r>
           </w:p>
         </w:tc>
@@ -3865,7 +3865,7 @@
                 <w:rFonts w:ascii="맑은 고딕" w:hAnsi="맑은 고딕" w:eastAsia="맑은 고딕"/>
                 <w:sz w:val="17"/>
               </w:rPr>
-              <w:t>600,000</w:t>
+              <w:t>480,000</w:t>
             </w:r>
           </w:p>
         </w:tc>
@@ -3924,7 +3924,7 @@
                 <w:rFonts w:ascii="맑은 고딕" w:hAnsi="맑은 고딕" w:eastAsia="맑은 고딕"/>
                 <w:sz w:val="17"/>
               </w:rPr>
-              <w:t>시제품 포장재: 티백 필터·지퍼 파우치·라벨</w:t>
+              <w:t>[시제품 제작비] 포장재: 티백 필터·지퍼 파우치·라벨</w:t>
             </w:r>
           </w:p>
           <w:p>
@@ -3936,7 +3936,7 @@
                 <w:rFonts w:ascii="맑은 고딕" w:hAnsi="맑은 고딕" w:eastAsia="맑은 고딕"/>
                 <w:sz w:val="17"/>
               </w:rPr>
-              <w:t>150세트 × 2,000원</w:t>
+              <w:t>150세트 × 1,400원</w:t>
             </w:r>
           </w:p>
         </w:tc>
@@ -3955,7 +3955,7 @@
                 <w:rFonts w:ascii="맑은 고딕" w:hAnsi="맑은 고딕" w:eastAsia="맑은 고딕"/>
                 <w:sz w:val="17"/>
               </w:rPr>
-              <w:t>300,000</w:t>
+              <w:t>210,000</w:t>
             </w:r>
           </w:p>
         </w:tc>
@@ -4026,7 +4026,19 @@
                 <w:rFonts w:ascii="맑은 고딕" w:hAnsi="맑은 고딕" w:eastAsia="맑은 고딕"/>
                 <w:sz w:val="17"/>
               </w:rPr>
-              <w:t>레시피북 인쇄: A5 24쪽 컬러 100부 × 4,000원</w:t>
+              <w:t>[시제품 제작비] 레시피북 인쇄: A5 24쪽 컬러</w:t>
+            </w:r>
+          </w:p>
+          <w:p>
+            <w:pPr>
+              <w:spacing w:after="0" w:line="264" w:lineRule="auto"/>
+            </w:pPr>
+            <w:r>
+              <w:rPr>
+                <w:rFonts w:ascii="맑은 고딕" w:hAnsi="맑은 고딕" w:eastAsia="맑은 고딕"/>
+                <w:sz w:val="17"/>
+              </w:rPr>
+              <w:t>100부 × 3,000원</w:t>
             </w:r>
           </w:p>
         </w:tc>
@@ -4045,7 +4057,7 @@
                 <w:rFonts w:ascii="맑은 고딕" w:hAnsi="맑은 고딕" w:eastAsia="맑은 고딕"/>
                 <w:sz w:val="17"/>
               </w:rPr>
-              <w:t>400,000</w:t>
+              <w:t>300,000</w:t>
             </w:r>
           </w:p>
         </w:tc>
@@ -4104,7 +4116,7 @@
                 <w:rFonts w:ascii="맑은 고딕" w:hAnsi="맑은 고딕" w:eastAsia="맑은 고딕"/>
                 <w:sz w:val="17"/>
               </w:rPr>
-              <w:t>홍보물: 포스터 10장 × 5,000원,</w:t>
+              <w:t>[프로그램 운영비] 홍보물: 포스터 10장 × 5,000원,</w:t>
             </w:r>
           </w:p>
           <w:p>
@@ -4116,7 +4128,7 @@
                 <w:rFonts w:ascii="맑은 고딕" w:hAnsi="맑은 고딕" w:eastAsia="맑은 고딕"/>
                 <w:sz w:val="17"/>
               </w:rPr>
-              <w:t>리플릿 500부 × 100원</w:t>
+              <w:t>리플릿 300부 × 100원</w:t>
             </w:r>
           </w:p>
         </w:tc>
@@ -4135,7 +4147,7 @@
                 <w:rFonts w:ascii="맑은 고딕" w:hAnsi="맑은 고딕" w:eastAsia="맑은 고딕"/>
                 <w:sz w:val="17"/>
               </w:rPr>
-              <w:t>100,000</w:t>
+              <w:t>80,000</w:t>
             </w:r>
           </w:p>
         </w:tc>
@@ -4194,7 +4206,7 @@
                 <w:rFonts w:ascii="맑은 고딕" w:hAnsi="맑은 고딕" w:eastAsia="맑은 고딕"/>
                 <w:sz w:val="17"/>
               </w:rPr>
-              <w:t>전문가 활용비: 봉동 생강 농가 강연 1회 × 200,000원,</w:t>
+              <w:t>[전문가 활용비] 봉동 생강 농가 강연 1회 × 200,000원,</w:t>
             </w:r>
           </w:p>
           <w:p>
@@ -4206,7 +4218,7 @@
                 <w:rFonts w:ascii="맑은 고딕" w:hAnsi="맑은 고딕" w:eastAsia="맑은 고딕"/>
                 <w:sz w:val="17"/>
               </w:rPr>
-              <w:t>식품 가공·위생 자문 1회 × 200,000원</w:t>
+              <w:t>식품 가공·위생 자문 1회 × 100,000원</w:t>
             </w:r>
           </w:p>
         </w:tc>
@@ -4225,7 +4237,7 @@
                 <w:rFonts w:ascii="맑은 고딕" w:hAnsi="맑은 고딕" w:eastAsia="맑은 고딕"/>
                 <w:sz w:val="17"/>
               </w:rPr>
-              <w:t>400,000</w:t>
+              <w:t>300,000</w:t>
             </w:r>
           </w:p>
         </w:tc>
@@ -4277,6 +4289,312 @@
                 <w:rFonts w:ascii="맑은 고딕" w:hAnsi="맑은 고딕" w:eastAsia="맑은 고딕"/>
                 <w:sz w:val="17"/>
               </w:rPr>
+              <w:t>실증·실행비</w:t>
+            </w:r>
+          </w:p>
+        </w:tc>
+        <w:tc>
+          <w:tcPr>
+            <w:tcW w:type="dxa" w:w="4989"/>
+            <w:vAlign w:val="center"/>
+          </w:tcPr>
+          <w:p>
+            <w:pPr>
+              <w:spacing w:after="0" w:line="264" w:lineRule="auto"/>
+            </w:pPr>
+            <w:r/>
+            <w:r>
+              <w:rPr>
+                <w:rFonts w:ascii="맑은 고딕" w:hAnsi="맑은 고딕" w:eastAsia="맑은 고딕"/>
+                <w:sz w:val="17"/>
+              </w:rPr>
+              <w:t>[프로그램 운영비-교통비] 행사 물품 운반 택시:</w:t>
+            </w:r>
+          </w:p>
+          <w:p>
+            <w:pPr>
+              <w:spacing w:after="0" w:line="264" w:lineRule="auto"/>
+            </w:pPr>
+            <w:r>
+              <w:rPr>
+                <w:rFonts w:ascii="맑은 고딕" w:hAnsi="맑은 고딕" w:eastAsia="맑은 고딕"/>
+                <w:sz w:val="17"/>
+              </w:rPr>
+              <w:t>8회(원데이 4·시음 2·간담회 2) × 왕복 30,000원</w:t>
+            </w:r>
+          </w:p>
+        </w:tc>
+        <w:tc>
+          <w:tcPr>
+            <w:tcW w:type="dxa" w:w="1247"/>
+            <w:vAlign w:val="center"/>
+          </w:tcPr>
+          <w:p>
+            <w:pPr>
+              <w:spacing w:after="0" w:line="264" w:lineRule="auto"/>
+            </w:pPr>
+            <w:r/>
+            <w:r>
+              <w:rPr>
+                <w:rFonts w:ascii="맑은 고딕" w:hAnsi="맑은 고딕" w:eastAsia="맑은 고딕"/>
+                <w:sz w:val="17"/>
+              </w:rPr>
+              <w:t>240,000</w:t>
+            </w:r>
+          </w:p>
+        </w:tc>
+        <w:tc>
+          <w:tcPr>
+            <w:tcW w:type="dxa" w:w="2154"/>
+            <w:vAlign w:val="center"/>
+          </w:tcPr>
+          <w:p>
+            <w:pPr>
+              <w:spacing w:after="0" w:line="264" w:lineRule="auto"/>
+            </w:pPr>
+            <w:r/>
+            <w:r>
+              <w:rPr>
+                <w:rFonts w:ascii="맑은 고딕" w:hAnsi="맑은 고딕" w:eastAsia="맑은 고딕"/>
+                <w:sz w:val="17"/>
+              </w:rPr>
+              <w:t>농산물·유리병·</w:t>
+            </w:r>
+          </w:p>
+          <w:p>
+            <w:pPr>
+              <w:spacing w:after="0" w:line="264" w:lineRule="auto"/>
+            </w:pPr>
+            <w:r>
+              <w:rPr>
+                <w:rFonts w:ascii="맑은 고딕" w:hAnsi="맑은 고딕" w:eastAsia="맑은 고딕"/>
+                <w:sz w:val="17"/>
+              </w:rPr>
+              <w:t>조리도구 운반</w:t>
+            </w:r>
+          </w:p>
+        </w:tc>
+      </w:tr>
+      <w:tr>
+        <w:tc>
+          <w:tcPr>
+            <w:tcW w:type="dxa" w:w="1247"/>
+            <w:vAlign w:val="center"/>
+          </w:tcPr>
+          <w:p>
+            <w:pPr>
+              <w:spacing w:after="0" w:line="264" w:lineRule="auto"/>
+            </w:pPr>
+            <w:r/>
+            <w:r>
+              <w:rPr>
+                <w:rFonts w:ascii="맑은 고딕" w:hAnsi="맑은 고딕" w:eastAsia="맑은 고딕"/>
+                <w:sz w:val="17"/>
+              </w:rPr>
+              <w:t>실증·실행비</w:t>
+            </w:r>
+          </w:p>
+        </w:tc>
+        <w:tc>
+          <w:tcPr>
+            <w:tcW w:type="dxa" w:w="4989"/>
+            <w:vAlign w:val="center"/>
+          </w:tcPr>
+          <w:p>
+            <w:pPr>
+              <w:spacing w:after="0" w:line="264" w:lineRule="auto"/>
+            </w:pPr>
+            <w:r/>
+            <w:r>
+              <w:rPr>
+                <w:rFonts w:ascii="맑은 고딕" w:hAnsi="맑은 고딕" w:eastAsia="맑은 고딕"/>
+                <w:sz w:val="17"/>
+              </w:rPr>
+              <w:t>[프로그램 운영비-교통비] 현장 조사·섭외 대중교통:</w:t>
+            </w:r>
+          </w:p>
+          <w:p>
+            <w:pPr>
+              <w:spacing w:after="0" w:line="264" w:lineRule="auto"/>
+            </w:pPr>
+            <w:r>
+              <w:rPr>
+                <w:rFonts w:ascii="맑은 고딕" w:hAnsi="맑은 고딕" w:eastAsia="맑은 고딕"/>
+                <w:sz w:val="17"/>
+              </w:rPr>
+              <w:t>2인 × 10회 × 왕복 3,500원</w:t>
+            </w:r>
+          </w:p>
+        </w:tc>
+        <w:tc>
+          <w:tcPr>
+            <w:tcW w:type="dxa" w:w="1247"/>
+            <w:vAlign w:val="center"/>
+          </w:tcPr>
+          <w:p>
+            <w:pPr>
+              <w:spacing w:after="0" w:line="264" w:lineRule="auto"/>
+            </w:pPr>
+            <w:r/>
+            <w:r>
+              <w:rPr>
+                <w:rFonts w:ascii="맑은 고딕" w:hAnsi="맑은 고딕" w:eastAsia="맑은 고딕"/>
+                <w:sz w:val="17"/>
+              </w:rPr>
+              <w:t>70,000</w:t>
+            </w:r>
+          </w:p>
+        </w:tc>
+        <w:tc>
+          <w:tcPr>
+            <w:tcW w:type="dxa" w:w="2154"/>
+            <w:vAlign w:val="center"/>
+          </w:tcPr>
+          <w:p>
+            <w:pPr>
+              <w:spacing w:after="0" w:line="264" w:lineRule="auto"/>
+            </w:pPr>
+            <w:r/>
+            <w:r>
+              <w:rPr>
+                <w:rFonts w:ascii="맑은 고딕" w:hAnsi="맑은 고딕" w:eastAsia="맑은 고딕"/>
+                <w:sz w:val="17"/>
+              </w:rPr>
+              <w:t>직매장·농가 방문</w:t>
+            </w:r>
+          </w:p>
+          <w:p>
+            <w:pPr>
+              <w:spacing w:after="0" w:line="264" w:lineRule="auto"/>
+            </w:pPr>
+            <w:r>
+              <w:rPr>
+                <w:rFonts w:ascii="맑은 고딕" w:hAnsi="맑은 고딕" w:eastAsia="맑은 고딕"/>
+                <w:sz w:val="17"/>
+              </w:rPr>
+              <w:t>(봉동·용진 등)</w:t>
+            </w:r>
+          </w:p>
+        </w:tc>
+      </w:tr>
+      <w:tr>
+        <w:tc>
+          <w:tcPr>
+            <w:tcW w:type="dxa" w:w="1247"/>
+            <w:vAlign w:val="center"/>
+          </w:tcPr>
+          <w:p>
+            <w:pPr>
+              <w:spacing w:after="0" w:line="264" w:lineRule="auto"/>
+            </w:pPr>
+            <w:r/>
+            <w:r>
+              <w:rPr>
+                <w:rFonts w:ascii="맑은 고딕" w:hAnsi="맑은 고딕" w:eastAsia="맑은 고딕"/>
+                <w:sz w:val="17"/>
+              </w:rPr>
+              <w:t>실증·실행비</w:t>
+            </w:r>
+          </w:p>
+        </w:tc>
+        <w:tc>
+          <w:tcPr>
+            <w:tcW w:type="dxa" w:w="4989"/>
+            <w:vAlign w:val="center"/>
+          </w:tcPr>
+          <w:p>
+            <w:pPr>
+              <w:spacing w:after="0" w:line="264" w:lineRule="auto"/>
+            </w:pPr>
+            <w:r/>
+            <w:r>
+              <w:rPr>
+                <w:rFonts w:ascii="맑은 고딕" w:hAnsi="맑은 고딕" w:eastAsia="맑은 고딕"/>
+                <w:sz w:val="17"/>
+              </w:rPr>
+              <w:t>[프로그램 운영비-식비] 행사 당일 현장 운영 인력 식비:</w:t>
+            </w:r>
+          </w:p>
+          <w:p>
+            <w:pPr>
+              <w:spacing w:after="0" w:line="264" w:lineRule="auto"/>
+            </w:pPr>
+            <w:r>
+              <w:rPr>
+                <w:rFonts w:ascii="맑은 고딕" w:hAnsi="맑은 고딕" w:eastAsia="맑은 고딕"/>
+                <w:sz w:val="17"/>
+              </w:rPr>
+              <w:t>2인 × 6일 × 10,000원</w:t>
+            </w:r>
+          </w:p>
+        </w:tc>
+        <w:tc>
+          <w:tcPr>
+            <w:tcW w:type="dxa" w:w="1247"/>
+            <w:vAlign w:val="center"/>
+          </w:tcPr>
+          <w:p>
+            <w:pPr>
+              <w:spacing w:after="0" w:line="264" w:lineRule="auto"/>
+            </w:pPr>
+            <w:r/>
+            <w:r>
+              <w:rPr>
+                <w:rFonts w:ascii="맑은 고딕" w:hAnsi="맑은 고딕" w:eastAsia="맑은 고딕"/>
+                <w:sz w:val="17"/>
+              </w:rPr>
+              <w:t>120,000</w:t>
+            </w:r>
+          </w:p>
+        </w:tc>
+        <w:tc>
+          <w:tcPr>
+            <w:tcW w:type="dxa" w:w="2154"/>
+            <w:vAlign w:val="center"/>
+          </w:tcPr>
+          <w:p>
+            <w:pPr>
+              <w:spacing w:after="0" w:line="264" w:lineRule="auto"/>
+            </w:pPr>
+            <w:r/>
+            <w:r>
+              <w:rPr>
+                <w:rFonts w:ascii="맑은 고딕" w:hAnsi="맑은 고딕" w:eastAsia="맑은 고딕"/>
+                <w:sz w:val="17"/>
+              </w:rPr>
+              <w:t>원데이 4회·시음 2회</w:t>
+            </w:r>
+          </w:p>
+          <w:p>
+            <w:pPr>
+              <w:spacing w:after="0" w:line="264" w:lineRule="auto"/>
+            </w:pPr>
+            <w:r>
+              <w:rPr>
+                <w:rFonts w:ascii="맑은 고딕" w:hAnsi="맑은 고딕" w:eastAsia="맑은 고딕"/>
+                <w:sz w:val="17"/>
+              </w:rPr>
+              <w:t>(준비~정리 5시간 이상)</w:t>
+            </w:r>
+          </w:p>
+        </w:tc>
+      </w:tr>
+      <w:tr>
+        <w:tc>
+          <w:tcPr>
+            <w:tcW w:type="dxa" w:w="1247"/>
+            <w:vAlign w:val="center"/>
+          </w:tcPr>
+          <w:p>
+            <w:pPr>
+              <w:spacing w:after="0" w:line="264" w:lineRule="auto"/>
+            </w:pPr>
+            <w:r/>
+            <w:r>
+              <w:rPr>
+                <w:rFonts w:ascii="맑은 고딕" w:hAnsi="맑은 고딕" w:eastAsia="맑은 고딕"/>
+                <w:sz w:val="17"/>
+              </w:rPr>
               <w:t>회의비</w:t>
             </w:r>
           </w:p>
@@ -4297,6 +4615,18 @@
                 <w:sz w:val="17"/>
               </w:rPr>
               <w:t>농가·주민 간담회 식대: 2회 × 10명 × 15,000원</w:t>
+            </w:r>
+          </w:p>
+          <w:p>
+            <w:pPr>
+              <w:spacing w:after="0" w:line="264" w:lineRule="auto"/>
+            </w:pPr>
+            <w:r>
+              <w:rPr>
+                <w:rFonts w:ascii="맑은 고딕" w:hAnsi="맑은 고딕" w:eastAsia="맑은 고딕"/>
+                <w:sz w:val="17"/>
+              </w:rPr>
+              <w:t>(팀원 2인 포함)</w:t>
             </w:r>
           </w:p>
         </w:tc>
@@ -4433,7 +4763,20 @@
           <w:rFonts w:ascii="맑은 고딕" w:hAnsi="맑은 고딕" w:eastAsia="맑은 고딕"/>
           <w:sz w:val="17"/>
         </w:rPr>
-        <w:t>※ 세부 집행 가능 여부는 선정 후 사업단 예산 검토에 따라 조정함</w:t>
+        <w:t>※ 교통비·식비는 사업단 예산편성 기준 범위 내에서 카드 영수증과 이동·활동 기록으로 증빙하며, 인정되지 않는 항목은 선정 후 예산 검토 시 재료비·회의비로 전환함</w:t>
+      </w:r>
+    </w:p>
+    <w:p>
+      <w:pPr>
+        <w:spacing w:before="0" w:after="40"/>
+        <w:ind w:left="170"/>
+      </w:pPr>
+      <w:r>
+        <w:rPr>
+          <w:rFonts w:ascii="맑은 고딕" w:hAnsi="맑은 고딕" w:eastAsia="맑은 고딕"/>
+          <w:sz w:val="17"/>
+        </w:rPr>
+        <w:t>※ 활동 거점(우석대, 완주군 삼례읍)에서 모든 현장까지 당일 이동이 가능하므로 숙박비는 편성하지 않음</w:t>
       </w:r>
     </w:p>
     <w:p>

</xml_diff>